<commit_message>
Separate cover from two-page Delivery 3 summary
</commit_message>
<xml_diff>
--- a/docs/AgendaPro_Delivery_3_Resumen_Editable.docx
+++ b/docs/AgendaPro_Delivery_3_Resumen_Editable.docx
@@ -482,9 +482,16 @@
       </w:tr>
     </w:tbl>
     <w:p>
-      <w:r>
-        <w:br w:type="page"/>
-      </w:r>
+      <w:pPr>
+        <w:sectPr>
+          <w:headerReference w:type="default" r:id="rId9"/>
+          <w:footerReference w:type="default" r:id="rId10"/>
+          <w:pgSz w:w="12240" w:h="15840"/>
+          <w:pgMar w:top="1080" w:right="1123" w:bottom="936" w:left="1123" w:header="504" w:footer="504" w:gutter="0"/>
+          <w:cols w:space="720"/>
+          <w:docGrid w:linePitch="360"/>
+        </w:sectPr>
+      </w:pPr>
     </w:p>
     <w:p>
       <w:pPr>
@@ -708,7 +715,7 @@
     </w:p>
     <w:p>
       <w:pPr>
-        <w:spacing w:before="0" w:after="80" w:line="259" w:lineRule="auto"/>
+        <w:spacing w:before="0" w:after="120" w:line="259" w:lineRule="auto"/>
       </w:pPr>
       <w:r>
         <w:rPr>
@@ -722,7 +729,99 @@
     </w:p>
     <w:p>
       <w:pPr>
-        <w:pStyle w:val="Heading2"/>
+        <w:pStyle w:val="Heading1"/>
+        <w:keepNext/>
+      </w:pPr>
+      <w:r>
+        <w:t>Navegación y persistencia</w:t>
+      </w:r>
+    </w:p>
+    <w:p>
+      <w:pPr>
+        <w:spacing w:before="0" w:after="120" w:line="259" w:lineRule="auto"/>
+      </w:pPr>
+      <w:r>
+        <w:rPr>
+          <w:rFonts w:ascii="Arial" w:hAnsi="Arial"/>
+          <w:b w:val="0"/>
+          <w:color w:val="16324F"/>
+          <w:sz w:val="19"/>
+        </w:rPr>
+        <w:t>Desde Inicio se puede entrar al detalle de un evento o al formulario de creación y regresar en ambos recorridos. Las actividades añadidas en el detalle se guardan por evento en el navegador, por lo que permanecen después de recargar la página en el mismo dispositivo.</w:t>
+      </w:r>
+    </w:p>
+    <w:p>
+      <w:pPr>
+        <w:pStyle w:val="Heading1"/>
+        <w:keepNext/>
+      </w:pPr>
+      <w:r>
+        <w:t>Documentación actualizada</w:t>
+      </w:r>
+    </w:p>
+    <w:p>
+      <w:pPr>
+        <w:spacing w:before="0" w:after="120" w:line="259" w:lineRule="auto"/>
+      </w:pPr>
+      <w:r>
+        <w:rPr>
+          <w:rFonts w:ascii="Arial" w:hAnsi="Arial"/>
+          <w:b w:val="0"/>
+          <w:color w:val="16324F"/>
+          <w:sz w:val="19"/>
+        </w:rPr>
+        <w:t>Se actualizó el FRD para documentar las tres pantallas, la navegación, el guardado local de actividades, los campos del formulario y la escritura en Supabase. También se alineó el Brand Brief con la identidad visual vigente: colores #16324F, #087E8B y #F7F9FC; tipografías Montserrat e Inter; Bootstrap, íconos, imagen local y favicon.</w:t>
+      </w:r>
+    </w:p>
+    <w:p>
+      <w:pPr>
+        <w:pStyle w:val="Heading1"/>
+        <w:keepNext/>
+      </w:pPr>
+      <w:r>
+        <w:t>Alcance de Delivery 3</w:t>
+      </w:r>
+    </w:p>
+    <w:p>
+      <w:pPr>
+        <w:spacing w:before="0" w:after="80" w:line="259" w:lineRule="auto"/>
+      </w:pPr>
+      <w:r>
+        <w:rPr>
+          <w:rFonts w:ascii="Arial" w:hAnsi="Arial"/>
+          <w:b w:val="0"/>
+          <w:color w:val="16324F"/>
+          <w:sz w:val="19"/>
+        </w:rPr>
+        <w:t>La versión mantiene una sola tabla y no incorpora cuentas, autenticación, chatbot, segunda tabla, backend propio ni sincronización con Google Calendar. Estas funciones permanecen fuera del alcance de esta entrega.</w:t>
+      </w:r>
+    </w:p>
+    <w:p>
+      <w:pPr>
+        <w:sectPr>
+          <w:pgSz w:w="12240" w:h="15840"/>
+          <w:pgMar w:top="1080" w:right="1123" w:bottom="936" w:left="1123" w:header="504" w:footer="504" w:gutter="0"/>
+          <w:cols w:space="720"/>
+          <w:docGrid w:linePitch="360"/>
+        </w:sectPr>
+      </w:pPr>
+    </w:p>
+    <w:p>
+      <w:pPr>
+        <w:spacing w:before="0" w:after="80" w:line="259" w:lineRule="auto"/>
+      </w:pPr>
+      <w:r>
+        <w:rPr>
+          <w:rFonts w:ascii="Arial" w:hAnsi="Arial"/>
+          <w:b w:val="0"/>
+          <w:color w:val="16324F"/>
+          <w:sz w:val="21"/>
+        </w:rPr>
+      </w:r>
+    </w:p>
+    <w:p>
+      <w:pPr>
+        <w:pStyle w:val="Heading1"/>
         <w:keepNext/>
       </w:pPr>
       <w:r>
@@ -731,13 +830,27 @@
     </w:p>
     <w:p>
       <w:pPr>
-        <w:spacing w:after="40"/>
+        <w:spacing w:before="0" w:after="120" w:line="259" w:lineRule="auto"/>
+      </w:pPr>
+      <w:r>
+        <w:rPr>
+          <w:rFonts w:ascii="Arial" w:hAnsi="Arial"/>
+          <w:b w:val="0"/>
+          <w:color w:val="16324F"/>
+          <w:sz w:val="20"/>
+        </w:rPr>
+        <w:t>La siguiente captura muestra la tabla public.eventos con registros creados mediante el formulario y la columna created_at visible como evidencia fechada.</w:t>
+      </w:r>
+    </w:p>
+    <w:p>
+      <w:pPr>
+        <w:spacing w:after="60"/>
         <w:jc w:val="center"/>
       </w:pPr>
       <w:r>
         <w:drawing>
           <wp:inline xmlns:a="http://schemas.openxmlformats.org/drawingml/2006/main" xmlns:pic="http://schemas.openxmlformats.org/drawingml/2006/picture">
-            <wp:extent cx="5212080" cy="3023149"/>
+            <wp:extent cx="5532120" cy="3208781"/>
             <wp:docPr id="1" name="Picture 1"/>
             <wp:cNvGraphicFramePr>
               <a:graphicFrameLocks noChangeAspect="1"/>
@@ -758,7 +871,7 @@
                   <pic:spPr>
                     <a:xfrm>
                       <a:off x="0" y="0"/>
-                      <a:ext cx="5212080" cy="3023149"/>
+                      <a:ext cx="5532120" cy="3208781"/>
                     </a:xfrm>
                     <a:prstGeom prst="rect"/>
                   </pic:spPr>
@@ -771,7 +884,7 @@
     </w:p>
     <w:p>
       <w:pPr>
-        <w:spacing w:before="0" w:after="100" w:line="259" w:lineRule="auto"/>
+        <w:spacing w:before="0" w:after="160" w:line="259" w:lineRule="auto"/>
         <w:jc w:val="center"/>
       </w:pPr>
       <w:r>
@@ -779,7 +892,7 @@
           <w:rFonts w:ascii="Arial" w:hAnsi="Arial"/>
           <w:b w:val="0"/>
           <w:color w:val="64748B"/>
-          <w:sz w:val="17"/>
+          <w:sz w:val="18"/>
         </w:rPr>
         <w:t>Tabla public.eventos con cuatro filas registradas y la columna created_at visible.</w:t>
       </w:r>
@@ -790,23 +903,238 @@
         <w:keepNext/>
       </w:pPr>
       <w:r>
-        <w:t>Documentación actualizada</w:t>
+        <w:t>Estado final de la entrega</w:t>
       </w:r>
     </w:p>
-    <w:p>
-      <w:pPr>
-        <w:spacing w:before="0" w:after="80" w:line="259" w:lineRule="auto"/>
-      </w:pPr>
-      <w:r>
-        <w:rPr>
-          <w:rFonts w:ascii="Arial" w:hAnsi="Arial"/>
-          <w:b w:val="0"/>
-          <w:color w:val="16324F"/>
-          <w:sz w:val="18"/>
-        </w:rPr>
-        <w:t>Se actualizó el FRD para documentar las tres pantallas, la navegación, el guardado local de actividades, los campos del formulario y la escritura en Supabase. También se alineó el Brand Brief con la identidad visual vigente.</w:t>
-      </w:r>
-    </w:p>
+    <w:tbl>
+      <w:tblPr>
+        <w:tblStyle w:val="TableGrid"/>
+        <w:tblW w:type="dxa" w:w="8496"/>
+        <w:jc w:val="center"/>
+        <w:tblLayout w:type="fixed"/>
+        <w:tblLook w:firstColumn="1" w:firstRow="1" w:lastColumn="0" w:lastRow="0" w:noHBand="0" w:noVBand="1" w:val="04A0"/>
+      </w:tblPr>
+      <w:tblGrid>
+        <w:gridCol w:w="3096"/>
+        <w:gridCol w:w="5400"/>
+      </w:tblGrid>
+      <w:tr>
+        <w:tc>
+          <w:tcPr>
+            <w:tcW w:type="dxa" w:w="3096"/>
+            <w:tcMar>
+              <w:top w:w="100" w:type="dxa"/>
+              <w:start w:w="140" w:type="dxa"/>
+              <w:bottom w:w="100" w:type="dxa"/>
+              <w:end w:w="140" w:type="dxa"/>
+            </w:tcMar>
+            <w:shd w:fill="F7F9FC"/>
+          </w:tcPr>
+          <w:p>
+            <w:pPr>
+              <w:spacing w:after="0"/>
+            </w:pPr>
+            <w:r>
+              <w:rPr>
+                <w:rFonts w:ascii="Arial" w:hAnsi="Arial"/>
+                <w:b/>
+                <w:color w:val="16324F"/>
+                <w:sz w:val="19"/>
+              </w:rPr>
+              <w:t>Producto y navegación</w:t>
+            </w:r>
+          </w:p>
+        </w:tc>
+        <w:tc>
+          <w:tcPr>
+            <w:tcW w:type="dxa" w:w="5400"/>
+            <w:tcMar>
+              <w:top w:w="100" w:type="dxa"/>
+              <w:start w:w="140" w:type="dxa"/>
+              <w:bottom w:w="100" w:type="dxa"/>
+              <w:end w:w="140" w:type="dxa"/>
+            </w:tcMar>
+            <w:shd w:fill="FFFFFF"/>
+          </w:tcPr>
+          <w:p>
+            <w:pPr>
+              <w:spacing w:after="0"/>
+            </w:pPr>
+            <w:r>
+              <w:rPr>
+                <w:rFonts w:ascii="Arial" w:hAnsi="Arial"/>
+                <w:b/>
+                <w:color w:val="087E8B"/>
+                <w:sz w:val="19"/>
+              </w:rPr>
+              <w:t>Completado</w:t>
+            </w:r>
+          </w:p>
+        </w:tc>
+      </w:tr>
+      <w:tr>
+        <w:tc>
+          <w:tcPr>
+            <w:tcW w:type="dxa" w:w="3096"/>
+            <w:tcMar>
+              <w:top w:w="100" w:type="dxa"/>
+              <w:start w:w="140" w:type="dxa"/>
+              <w:bottom w:w="100" w:type="dxa"/>
+              <w:end w:w="140" w:type="dxa"/>
+            </w:tcMar>
+            <w:shd w:fill="F7F9FC"/>
+          </w:tcPr>
+          <w:p>
+            <w:pPr>
+              <w:spacing w:after="0"/>
+            </w:pPr>
+            <w:r>
+              <w:rPr>
+                <w:rFonts w:ascii="Arial" w:hAnsi="Arial"/>
+                <w:b/>
+                <w:color w:val="16324F"/>
+                <w:sz w:val="19"/>
+              </w:rPr>
+              <w:t>Formulario y Supabase</w:t>
+            </w:r>
+          </w:p>
+        </w:tc>
+        <w:tc>
+          <w:tcPr>
+            <w:tcW w:type="dxa" w:w="5400"/>
+            <w:tcMar>
+              <w:top w:w="100" w:type="dxa"/>
+              <w:start w:w="140" w:type="dxa"/>
+              <w:bottom w:w="100" w:type="dxa"/>
+              <w:end w:w="140" w:type="dxa"/>
+            </w:tcMar>
+            <w:shd w:fill="FFFFFF"/>
+          </w:tcPr>
+          <w:p>
+            <w:pPr>
+              <w:spacing w:after="0"/>
+            </w:pPr>
+            <w:r>
+              <w:rPr>
+                <w:rFonts w:ascii="Arial" w:hAnsi="Arial"/>
+                <w:b/>
+                <w:color w:val="087E8B"/>
+                <w:sz w:val="19"/>
+              </w:rPr>
+              <w:t>Completado</w:t>
+            </w:r>
+          </w:p>
+        </w:tc>
+      </w:tr>
+      <w:tr>
+        <w:tc>
+          <w:tcPr>
+            <w:tcW w:type="dxa" w:w="3096"/>
+            <w:tcMar>
+              <w:top w:w="100" w:type="dxa"/>
+              <w:start w:w="140" w:type="dxa"/>
+              <w:bottom w:w="100" w:type="dxa"/>
+              <w:end w:w="140" w:type="dxa"/>
+            </w:tcMar>
+            <w:shd w:fill="F7F9FC"/>
+          </w:tcPr>
+          <w:p>
+            <w:pPr>
+              <w:spacing w:after="0"/>
+            </w:pPr>
+            <w:r>
+              <w:rPr>
+                <w:rFonts w:ascii="Arial" w:hAnsi="Arial"/>
+                <w:b/>
+                <w:color w:val="16324F"/>
+                <w:sz w:val="19"/>
+              </w:rPr>
+              <w:t>README, FRD y evidencia</w:t>
+            </w:r>
+          </w:p>
+        </w:tc>
+        <w:tc>
+          <w:tcPr>
+            <w:tcW w:type="dxa" w:w="5400"/>
+            <w:tcMar>
+              <w:top w:w="100" w:type="dxa"/>
+              <w:start w:w="140" w:type="dxa"/>
+              <w:bottom w:w="100" w:type="dxa"/>
+              <w:end w:w="140" w:type="dxa"/>
+            </w:tcMar>
+            <w:shd w:fill="FFFFFF"/>
+          </w:tcPr>
+          <w:p>
+            <w:pPr>
+              <w:spacing w:after="0"/>
+            </w:pPr>
+            <w:r>
+              <w:rPr>
+                <w:rFonts w:ascii="Arial" w:hAnsi="Arial"/>
+                <w:b/>
+                <w:color w:val="087E8B"/>
+                <w:sz w:val="19"/>
+              </w:rPr>
+              <w:t>Completado</w:t>
+            </w:r>
+          </w:p>
+        </w:tc>
+      </w:tr>
+      <w:tr>
+        <w:tc>
+          <w:tcPr>
+            <w:tcW w:type="dxa" w:w="3096"/>
+            <w:tcMar>
+              <w:top w:w="100" w:type="dxa"/>
+              <w:start w:w="140" w:type="dxa"/>
+              <w:bottom w:w="100" w:type="dxa"/>
+              <w:end w:w="140" w:type="dxa"/>
+            </w:tcMar>
+            <w:shd w:fill="F7F9FC"/>
+          </w:tcPr>
+          <w:p>
+            <w:pPr>
+              <w:spacing w:after="0"/>
+            </w:pPr>
+            <w:r>
+              <w:rPr>
+                <w:rFonts w:ascii="Arial" w:hAnsi="Arial"/>
+                <w:b/>
+                <w:color w:val="16324F"/>
+                <w:sz w:val="19"/>
+              </w:rPr>
+              <w:t>Acceso del instructor</w:t>
+            </w:r>
+          </w:p>
+        </w:tc>
+        <w:tc>
+          <w:tcPr>
+            <w:tcW w:type="dxa" w:w="5400"/>
+            <w:tcMar>
+              <w:top w:w="100" w:type="dxa"/>
+              <w:start w:w="140" w:type="dxa"/>
+              <w:bottom w:w="100" w:type="dxa"/>
+              <w:end w:w="140" w:type="dxa"/>
+            </w:tcMar>
+            <w:shd w:fill="FFF2CC"/>
+          </w:tcPr>
+          <w:p>
+            <w:pPr>
+              <w:spacing w:after="0"/>
+            </w:pPr>
+            <w:r>
+              <w:rPr>
+                <w:rFonts w:ascii="Arial" w:hAnsi="Arial"/>
+                <w:b w:val="0"/>
+                <w:color w:val="16324F"/>
+                <w:sz w:val="19"/>
+              </w:rPr>
+              <w:t>[CONFIRMAR ANTES DE ENTREGAR]</w:t>
+            </w:r>
+          </w:p>
+        </w:tc>
+      </w:tr>
+    </w:tbl>
     <w:tbl>
       <w:tblPr>
         <w:tblStyle w:val="TableGrid"/>
@@ -841,7 +1169,7 @@
                 <w:color w:val="087E8B"/>
                 <w:sz w:val="18"/>
               </w:rPr>
-              <w:t xml:space="preserve">Complete antes de entregar: </w:t>
+              <w:t xml:space="preserve">Nota editable: </w:t>
             </w:r>
             <w:r>
               <w:rPr>
@@ -850,15 +1178,13 @@
                 <w:color w:val="16324F"/>
                 <w:sz w:val="17"/>
               </w:rPr>
-              <w:t>[CONFIRMAR QUE VERCEL ABRE SIN INICIAR SESIÓN Y QUE EL INSTRUCTOR TIENE ACCESO AL REPOSITORIO]</w:t>
+              <w:t>[AGREGUE AQUÍ CUALQUIER OBSERVACIÓN FINAL O ELIMINE ESTE RECUADRO]</w:t>
             </w:r>
           </w:p>
         </w:tc>
       </w:tr>
     </w:tbl>
     <w:sectPr>
-      <w:headerReference w:type="default" r:id="rId9"/>
-      <w:footerReference w:type="default" r:id="rId10"/>
       <w:pgSz w:w="12240" w:h="15840"/>
       <w:pgMar w:top="1080" w:right="1123" w:bottom="936" w:left="1123" w:header="504" w:footer="504" w:gutter="0"/>
       <w:cols w:space="720"/>

</xml_diff>